<commit_message>
docs: quantify enablement work, note upcoming seminar
</commit_message>
<xml_diff>
--- a/Ahmet-Kazankaya-CV.docx
+++ b/Ahmet-Kazankaya-CV.docx
@@ -165,7 +165,7 @@
           <w:color w:val="1A1A1A"/>
           <w:sz w:val="20"/>
         </w:rPr>
-        <w:t>Building the automation is half the work; the other half is getting people to use it. At the foundation I run the enablement sessions for the systems I build, one to one and in small groups, so the people who depend on them can operate them without me in the loop. Most of what I teach is not which button to press but where the tool is confident and wrong, because that is what decides whether someone keeps using it after the first bad answer. The same instinct produced guard-20 and audit-20: my own working rules, written down clearly enough that other developers install and run them unchanged.</w:t>
+        <w:t>Building the automation is half the work; the other half is getting people to use it. At the foundation I ran the enablement for a team of fifteen: mostly one to one at their desks, sometimes a few people at once around a screen. That covered both the AI tools that fit each person's own job and the automations I built for them, and I am now preparing a seminar on AI use for the whole foundation. Most of what I teach is not which button to press but where the tool is confident and wrong, because that is what decides whether someone keeps using it after the first bad answer. The same instinct produced guard-20 and audit-20: my own working rules, written down clearly enough that other developers install and run them unchanged.</w:t>
       </w:r>
     </w:p>
     <w:p>
@@ -221,7 +221,7 @@
           <w:color w:val="1A1A1A"/>
           <w:sz w:val="20"/>
         </w:rPr>
-        <w:t>The director used to read every incoming email, decide who should do each job, then track every delivery himself. The system reads the mailbox, turns each message into a task definition with an LLM, assigns it, and puts every job on an office TV board. I also train the staff who use it, one to one and in groups, so the system runs without me in the loop.</w:t>
+        <w:t>The director used to read every incoming email, decide who should do each job, then track every delivery himself. The system reads the mailbox, turns each message into a task definition with an LLM, assigns it, and puts every job on an office TV board. I also trained the team that uses it, so the system runs without me in the loop.</w:t>
       </w:r>
     </w:p>
     <w:p>

</xml_diff>

<commit_message>
docs: add dates and locations to projects
</commit_message>
<xml_diff>
--- a/Ahmet-Kazankaya-CV.docx
+++ b/Ahmet-Kazankaya-CV.docx
@@ -173,7 +173,7 @@
         <w:pStyle w:val="Heading2"/>
       </w:pPr>
       <w:r>
-        <w:t>Selected work</w:t>
+        <w:t>Selected projects</w:t>
       </w:r>
     </w:p>
     <w:p>
@@ -205,7 +205,7 @@
           <w:color w:val="555555"/>
           <w:sz w:val="18"/>
         </w:rPr>
-        <w:t>Türkiye Maarif Vakfı · in production, running for four months</w:t>
+        <w:t>Türkiye Maarif Vakfı · Istanbul · Apr 2026 to present · in production for four months</w:t>
       </w:r>
     </w:p>
     <w:p>
@@ -280,7 +280,7 @@
           <w:color w:val="555555"/>
           <w:sz w:val="18"/>
         </w:rPr>
-        <w:t>working prototype</w:t>
+        <w:t>personal project · Istanbul · Apr 2026 to present · working prototype</w:t>
       </w:r>
     </w:p>
     <w:p>
@@ -355,7 +355,7 @@
           <w:color w:val="555555"/>
           <w:sz w:val="18"/>
         </w:rPr>
-        <w:t>own production business · running daily</w:t>
+        <w:t>own production business · remote · Jun 2026 to present · running daily</w:t>
       </w:r>
     </w:p>
     <w:p>
@@ -430,7 +430,7 @@
           <w:color w:val="555555"/>
           <w:sz w:val="18"/>
         </w:rPr>
-        <w:t>building iOS apps from the phone, without sitting at a Mac</w:t>
+        <w:t>personal project · remote · Jun 2026 · building iOS apps from the phone, without sitting at a Mac</w:t>
       </w:r>
     </w:p>
     <w:p>
@@ -505,7 +505,7 @@
           <w:color w:val="555555"/>
           <w:sz w:val="18"/>
         </w:rPr>
-        <w:t>open source · github.com/kasparovabi · installed by other developers</w:t>
+        <w:t>open source · remote · Jul 2026 to present · github.com/kasparovabi · installed by other developers</w:t>
       </w:r>
     </w:p>
     <w:p>

</xml_diff>

<commit_message>
docs: mark Maarif as consulting engagement, correct start to Feb 2026
</commit_message>
<xml_diff>
--- a/Ahmet-Kazankaya-CV.docx
+++ b/Ahmet-Kazankaya-CV.docx
@@ -79,7 +79,7 @@
           <w:color w:val="1A1A1A"/>
           <w:sz w:val="20"/>
         </w:rPr>
-        <w:t>I came to software through production work rather than a computer science degree; my focus is systems and automation. Since early 2026, with Claude Code as the primary tool, I have shipped a task system running four months at a foundation, an automation line that prices and lists real products on Etsy, an ESP32 robot with voice, and two open source skill sets other people install. A model writes the code and the failures land on me, so I know where these tools mislead. I also run the sessions that put these tools in other people's hands.</w:t>
+        <w:t>I came to software through production work rather than a computer science degree; my focus is systems and automation. Since early 2026, with Claude Code as the primary tool, I have shipped a task system running four months for a foundation I consult for, an automation line that prices and lists real products on Etsy, an ESP32 robot with voice, and two open source skill sets other people install. A model writes the code and the failures land on me, so I know where these tools mislead. I also run the sessions that put these tools in other people's hands.</w:t>
       </w:r>
     </w:p>
     <w:p>
@@ -205,7 +205,7 @@
           <w:color w:val="555555"/>
           <w:sz w:val="18"/>
         </w:rPr>
-        <w:t>Türkiye Maarif Vakfı · Istanbul · Apr 2026 to present · in production for four months</w:t>
+        <w:t>Türkiye Maarif Vakfı · consulting engagement · Istanbul · Apr 2026 to present · in production</w:t>
       </w:r>
     </w:p>
     <w:p>
@@ -772,7 +772,7 @@
           <w:color w:val="555555"/>
           <w:sz w:val="20"/>
         </w:rPr>
-        <w:t xml:space="preserve">  ·  Türkiye Maarif Vakfı  ·  Istanbul  ·  Mar 2026 to present</w:t>
+        <w:t xml:space="preserve">  ·  Türkiye Maarif Vakfı  ·  Istanbul, consulting engagement  ·  Feb 2026 to present</w:t>
       </w:r>
     </w:p>
     <w:p>

</xml_diff>

<commit_message>
docs: task management dated from March
</commit_message>
<xml_diff>
--- a/Ahmet-Kazankaya-CV.docx
+++ b/Ahmet-Kazankaya-CV.docx
@@ -79,7 +79,7 @@
           <w:color w:val="1A1A1A"/>
           <w:sz w:val="20"/>
         </w:rPr>
-        <w:t>I came to software through production work rather than a computer science degree; my focus is systems and automation. Since early 2026, with Claude Code as the primary tool, I have shipped a task system running four months for a foundation I consult for, an automation line that prices and lists real products on Etsy, an ESP32 robot with voice, and two open source skill sets other people install. A model writes the code and the failures land on me, so I know where these tools mislead. I also run the sessions that put these tools in other people's hands.</w:t>
+        <w:t>I came to software through production work rather than a computer science degree; my focus is systems and automation. Since early 2026, with Claude Code as the primary tool, I have shipped a task system in production since March for a foundation I consult for, an automation line that prices and lists real products on Etsy, an ESP32 robot with voice, and two open source skill sets other people install. A model writes the code and the failures land on me, so I know where these tools mislead. I also run the sessions that put these tools in other people's hands.</w:t>
       </w:r>
     </w:p>
     <w:p>
@@ -205,7 +205,7 @@
           <w:color w:val="555555"/>
           <w:sz w:val="18"/>
         </w:rPr>
-        <w:t>Türkiye Maarif Vakfı · consulting engagement · Istanbul · Apr 2026 to present · in production</w:t>
+        <w:t>Türkiye Maarif Vakfı · consulting engagement · Istanbul · Mar 2026 to present · in production</w:t>
       </w:r>
     </w:p>
     <w:p>

</xml_diff>

<commit_message>
Retarget site from one company to any recruiter, plus ATS structure
Title, meta description and role line now name the job being applied for
rather than a self-description. Availability for Europe is stated where a
recruiter actually reads it, in Summary, after three attempts over the
animated hero proved unreadable.

Structure for ATS and search: single h1, four h2 section headings, Person
JSON-LD with skills and languages, Open Graph tags for link previews.

Content: security disclosure case added, summary opens with the platform
claim, CV in both PDF and Word refreshed to the current version.
</commit_message>
<xml_diff>
--- a/Ahmet-Kazankaya-CV.docx
+++ b/Ahmet-Kazankaya-CV.docx
@@ -4,7 +4,7 @@
   <w:body>
     <w:p>
       <w:pPr>
-        <w:pStyle w:val="Heading1"/>
+        <w:jc w:val="left"/>
       </w:pPr>
       <w:r>
         <w:t>Ahmet Kazankaya</w:t>
@@ -12,928 +12,409 @@
     </w:p>
     <w:p>
       <w:pPr>
-        <w:keepNext w:val="0"/>
-        <w:spacing w:after="60" w:before="0"/>
+        <w:jc w:val="left"/>
       </w:pPr>
       <w:r>
-        <w:rPr>
-          <w:rFonts w:ascii="Georgia" w:hAnsi="Georgia"/>
-          <w:b/>
-          <w:i w:val="0"/>
-          <w:color w:val="8A5322"/>
-          <w:sz w:val="19"/>
-        </w:rPr>
-        <w:t>AI-ASSISTED DEVELOPER / AUTOMATION AND ENABLEMENT</w:t>
+        <w:t>AI PLATFORM ENGINEER · AGENT INFRASTRUCTURE, EVALUATION AND GOVERNANCE</w:t>
       </w:r>
     </w:p>
     <w:p>
       <w:pPr>
-        <w:keepNext w:val="0"/>
-        <w:spacing w:after="60" w:before="0"/>
+        <w:jc w:val="left"/>
       </w:pPr>
       <w:r>
-        <w:rPr>
-          <w:rFonts w:ascii="Georgia" w:hAnsi="Georgia"/>
-          <w:b w:val="0"/>
-          <w:i/>
-          <w:color w:val="1A1A1A"/>
-          <w:sz w:val="21"/>
-        </w:rPr>
-        <w:t>One human, several agents. I decide, review and debug; they type.</w:t>
+        <w:t>Istanbul, Turkey · open to relocation in Europe, remote works too</w:t>
       </w:r>
     </w:p>
     <w:p>
       <w:pPr>
-        <w:keepNext w:val="0"/>
-        <w:spacing w:after="40" w:before="0"/>
+        <w:jc w:val="left"/>
       </w:pPr>
       <w:r>
+        <w:t>ahmetkazankaya1@gmail.com · +90 536 214 8114 · linkedin.com/in/ahmetkazankaya · github.com/kasparovabi</w:t>
+      </w:r>
+    </w:p>
+    <w:p>
+      <w:r>
         <w:rPr>
-          <w:rFonts w:ascii="Georgia" w:hAnsi="Georgia"/>
-          <w:b w:val="0"/>
-          <w:i w:val="0"/>
-          <w:color w:val="555555"/>
-          <w:sz w:val="17"/>
+          <w:b/>
+          <w:color w:val="1A1A1A"/>
+          <w:sz w:val="24"/>
         </w:rPr>
-        <w:t>Istanbul, Turkey (remote)  ·  ahmetkazankaya1@gmail.com  ·  +90 536 214 8114  ·  linkedin.com/in/ahmetkazankaya  ·  github.com/kasparovabi</w:t>
+        <w:t>SUMMARY</w:t>
       </w:r>
     </w:p>
     <w:p>
       <w:pPr>
-        <w:pStyle w:val="Heading2"/>
+        <w:jc w:val="left"/>
       </w:pPr>
       <w:r>
-        <w:t>Summary</w:t>
+        <w:t>I build the platform layer that makes LLM agent workflows run reliably in production: execution runtimes, human approval gates, permission boundaries, run logging and the evaluation harnesses that decide whether an agent is allowed to ship. I own the architecture end to end, from the first design decision to the pager. I came to software through production work rather than a computer science degree, and my process assumes model output is wrong until something independent proves otherwise.</w:t>
       </w:r>
     </w:p>
     <w:p>
       <w:pPr>
-        <w:keepNext w:val="0"/>
-        <w:spacing w:after="120" w:before="0"/>
+        <w:jc w:val="left"/>
       </w:pPr>
       <w:r>
+        <w:t>Since February 2026 I have consulted for a foundation running schools in 66 countries, where I own the internal automation platforms used daily by non-engineering teams: 14 applications in six months, 12 of them live, running reliably at department scale without me in the loop. I also run the enablement, so the systems keep working without me in the loop. The LLM agents I develop run in production against real users and real money, not as prototypes. I create and maintain open source developer tools that other engineers install and run unchanged, and I ensure the same verification gates apply to my own work.</w:t>
+      </w:r>
+    </w:p>
+    <w:p>
+      <w:r>
         <w:rPr>
-          <w:rFonts w:ascii="Georgia" w:hAnsi="Georgia"/>
-          <w:b w:val="0"/>
-          <w:i w:val="0"/>
+          <w:b/>
           <w:color w:val="1A1A1A"/>
-          <w:sz w:val="20"/>
+          <w:sz w:val="24"/>
         </w:rPr>
-        <w:t>I came to software through production work rather than a computer science degree; my focus is systems and automation. Since early 2026, with Claude Code as the primary tool, I have shipped a task system in production since March for a foundation I consult for, an automation line that prices and lists real products on Etsy, an ESP32 robot with voice, and two open source skill sets other people install. A model writes the code and the failures land on me, so I know where these tools mislead. I also run the sessions that put these tools in other people's hands.</w:t>
+        <w:t>PLATFORM AND RELIABILITY WORK</w:t>
+      </w:r>
+    </w:p>
+    <w:p>
+      <w:r>
+        <w:rPr>
+          <w:b/>
+        </w:rPr>
+        <w:t>Execution platform and durable workflows.</w:t>
       </w:r>
     </w:p>
     <w:p>
       <w:pPr>
-        <w:pStyle w:val="Heading2"/>
+        <w:jc w:val="left"/>
       </w:pPr>
       <w:r>
-        <w:t>How I work with AI</w:t>
+        <w:t>Event-triggered pipelines with scheduled and webhook entry points, durable state in Postgres and SQLite, job queues, retry and catch-up logic. The platform enables non-engineers to trigger reliable AI workflows without touching the runtime, and I monitor every run for failure and drift. A watchdog re-triggers runs that silently failed, capped at 3 attempts per day so a broken job cannot loop forever, because a scheduled job that dies quietly is worse than one that errors loudly. Every run is logged end to end and traceable back to its inputs, and failed runs trigger rollback rather than leaving half-written state behind.</w:t>
+      </w:r>
+    </w:p>
+    <w:p>
+      <w:r>
+        <w:rPr>
+          <w:b/>
+        </w:rPr>
+        <w:t>Model-agnostic runtime and cost control.</w:t>
       </w:r>
     </w:p>
     <w:p>
       <w:pPr>
-        <w:keepNext w:val="0"/>
-        <w:spacing w:after="120" w:before="0"/>
+        <w:jc w:val="left"/>
       </w:pPr>
       <w:r>
-        <w:rPr>
-          <w:rFonts w:ascii="Georgia" w:hAnsi="Georgia"/>
-          <w:b/>
-          <w:i w:val="0"/>
-          <w:color w:val="1A1A1A"/>
-          <w:sz w:val="20"/>
-        </w:rPr>
-        <w:t xml:space="preserve">Working model. </w:t>
+        <w:t>Each task routes to the cheapest model that can complete it, across Anthropic, OpenAI and local Ollama, through OpenRouter and provider SDKs. Token spend, latency and failure rates are tracked per run, so cost and reliability are observable rather than estimated. A CI check validates every model identifier in the codebase against the live provider API, 10 models verified per run, so a retired model can never reach production. I have contributed this check upstream to open source agent tooling.</w:t>
       </w:r>
+    </w:p>
+    <w:p>
       <w:r>
         <w:rPr>
-          <w:rFonts w:ascii="Georgia" w:hAnsi="Georgia"/>
-          <w:b w:val="0"/>
-          <w:i w:val="0"/>
-          <w:color w:val="1A1A1A"/>
-          <w:sz w:val="20"/>
+          <w:b/>
         </w:rPr>
-        <w:t>Architecture and constraints go into per repository steering files; each task routes to the cheapest model that can do it; I read every diff before it lands. The same loop covers analysis, documentation and design, not only coding. Testing runs headless: Unity batchmode builds, xcodebuild with simulator screenshots, pytest and vitest suites the agent must pass. The automation carries the repetitive load, so I run several lines at once.</w:t>
+        <w:t>Evaluation layer.</w:t>
       </w:r>
     </w:p>
     <w:p>
       <w:pPr>
-        <w:keepNext w:val="0"/>
-        <w:spacing w:after="120" w:before="0"/>
+        <w:jc w:val="left"/>
       </w:pPr>
       <w:r>
-        <w:rPr>
-          <w:rFonts w:ascii="Georgia" w:hAnsi="Georgia"/>
-          <w:b/>
-          <w:i w:val="0"/>
-          <w:color w:val="1A1A1A"/>
-          <w:sz w:val="20"/>
-        </w:rPr>
-        <w:t xml:space="preserve">Risks and limits. </w:t>
+        <w:t>audit-20 turns twenty recurring failure classes in AI-generated code into a CI gate of twenty behavioral checks that catches unreliable output during development rather than after release, with a final pass whose only job is to falsify the previous nineteen, plus a false-positive filter so real defects are not buried in noise. Safety-relevant classes are checked against golden outputs and monitored per run, so a safety regression fails the build instead of reaching a user. When the gate made output worse on a newer model generation, an evaluation harness running the same task 20 times with and without it proved the effect was real and model-dependent, so the scaffold is now gated by model rather than always on. That harness is the reason I trust the gate at all.</w:t>
       </w:r>
+    </w:p>
+    <w:p>
       <w:r>
         <w:rPr>
-          <w:rFonts w:ascii="Georgia" w:hAnsi="Georgia"/>
-          <w:b w:val="0"/>
-          <w:i w:val="0"/>
-          <w:color w:val="1A1A1A"/>
-          <w:sz w:val="20"/>
+          <w:b/>
         </w:rPr>
-        <w:t>A model is confident in exactly the places it is weakest, so my process assumes the output is wrong until something independent says otherwise. I refuse blocklist style fixes, which patch where the symptom shows rather than what broke. One research loop rejected 87 hypotheses over 170 iterations and returned the answer I did not want. I keep a searchable knowledge layer over what I read, with weekly lint runs for contradictions and stale claims, and verify current practice before choosing a stack, because a model's training data is older than the problem in front of me.</w:t>
+        <w:t>Governance and least privilege.</w:t>
       </w:r>
     </w:p>
     <w:p>
       <w:pPr>
-        <w:keepNext w:val="0"/>
-        <w:spacing w:after="120" w:before="0"/>
+        <w:jc w:val="left"/>
       </w:pPr>
       <w:r>
-        <w:rPr>
-          <w:rFonts w:ascii="Georgia" w:hAnsi="Georgia"/>
-          <w:b/>
-          <w:i w:val="0"/>
-          <w:color w:val="1A1A1A"/>
-          <w:sz w:val="20"/>
-        </w:rPr>
-        <w:t xml:space="preserve">Handing it over. </w:t>
+        <w:t>Governance mechanisms are built into the platform rather than written in a policy document. Risk tiers decide what needs review: high-risk actions require human approval, so nothing reaches a live storefront, a customer inbox or a public repository without a person approving it first. Access controls and secret management are enforced at the runtime boundary. Permissions are scoped per job with audit logging on every privileged call, tool access is granted per task rather than per agent, credentials are held outside the agent context, and infrastructure runs inside a Tailscale private network with no ports exposed to the internet. Restrictions are enforced by system design, not by prompts.</w:t>
       </w:r>
+    </w:p>
+    <w:p>
       <w:r>
         <w:rPr>
-          <w:rFonts w:ascii="Georgia" w:hAnsi="Georgia"/>
-          <w:b w:val="0"/>
-          <w:i w:val="0"/>
-          <w:color w:val="1A1A1A"/>
-          <w:sz w:val="20"/>
+          <w:b/>
         </w:rPr>
-        <w:t>Building the automation is half the work; the other half is getting people to use it. At the foundation I ran the enablement for a team of fifteen: mostly one to one at their desks, sometimes a few people at once around a screen. That covered both the AI tools that fit each person's own job and the automations I built for them, and I am now preparing a seminar on AI use for the whole foundation. Most of what I teach is not which button to press but where the tool is confident and wrong, because that is what decides whether someone keeps using it after the first bad answer. The same instinct produced guard-20 and audit-20: my own working rules, written down clearly enough that other developers install and run them unchanged.</w:t>
+        <w:t>Security research and coordinated disclosure.</w:t>
       </w:r>
     </w:p>
     <w:p>
       <w:pPr>
-        <w:pStyle w:val="Heading2"/>
+        <w:jc w:val="left"/>
       </w:pPr>
       <w:r>
-        <w:t>Selected projects</w:t>
+        <w:t>Two coordinated disclosures against open-source AI tooling, both filed privately through the vendor's own channel with no working exploit published. The first covered 17 vulnerabilities in a wearable AI device backend, aggregate CVSS 10.0, including remote code execution, authentication bypass, SSRF and a hardcoded production key; the vendor's own hardening commit names that disclosure in its title, so the outcome is verifiable in their git history rather than only in my write-up. The second reported that a documented filesystem allowlist did not exist in the shipped Rust binary, so the hardening step the project told operators to take did nothing.</w:t>
       </w:r>
     </w:p>
     <w:p>
       <w:pPr>
-        <w:keepNext/>
-        <w:spacing w:after="20" w:before="120"/>
+        <w:jc w:val="left"/>
       </w:pPr>
       <w:r>
+        <w:t>I reproduce every finding locally before reporting, and I check each one against already-published advisories first: one prepared report was dropped unsent because an existing CVE already covered it. Reporting less is part of the discipline, since a duplicate costs a maintainer the same time as a real bug. Full timeline and artifacts: github.com/kasparovabi/security-research</w:t>
+      </w:r>
+    </w:p>
+    <w:p>
+      <w:r>
         <w:rPr>
-          <w:rFonts w:ascii="Georgia" w:hAnsi="Georgia"/>
           <w:b/>
-          <w:i w:val="0"/>
-          <w:color w:val="1A1A1A"/>
-          <w:sz w:val="21"/>
         </w:rPr>
-        <w:t>Maarif Task Management</w:t>
+        <w:t>User adoption and measurement.</w:t>
       </w:r>
     </w:p>
     <w:p>
       <w:pPr>
-        <w:keepNext/>
-        <w:spacing w:after="60" w:before="0"/>
+        <w:jc w:val="left"/>
       </w:pPr>
       <w:r>
+        <w:t>Platforms are instrumented for usage, failure rates and cost, so impact across the organization is measurable rather than asserted. I ran one-to-one enablement for a team of 15 and am preparing a foundation-wide seminar, because adoption is the half of the work that decides whether any of it survives.</w:t>
+      </w:r>
+    </w:p>
+    <w:p>
+      <w:r>
         <w:rPr>
-          <w:rFonts w:ascii="Georgia" w:hAnsi="Georgia"/>
-          <w:b w:val="0"/>
-          <w:i w:val="0"/>
-          <w:color w:val="555555"/>
-          <w:sz w:val="18"/>
+          <w:b/>
+          <w:color w:val="1A1A1A"/>
+          <w:sz w:val="24"/>
         </w:rPr>
-        <w:t>Türkiye Maarif Vakfı · consulting engagement · Istanbul · Mar 2026 to present · in production</w:t>
+        <w:t>SELECTED SYSTEMS</w:t>
       </w:r>
     </w:p>
     <w:p>
       <w:pPr>
-        <w:keepNext w:val="0"/>
-        <w:spacing w:after="60" w:before="0"/>
+        <w:jc w:val="left"/>
       </w:pPr>
       <w:r>
-        <w:rPr>
-          <w:rFonts w:ascii="Georgia" w:hAnsi="Georgia"/>
-          <w:b w:val="0"/>
-          <w:i w:val="0"/>
-          <w:color w:val="1A1A1A"/>
-          <w:sz w:val="20"/>
-        </w:rPr>
-        <w:t>The director used to read every incoming email, decide who should do each job, then track every delivery himself. The system reads the mailbox, turns each message into a task definition with an LLM, assigns it, and puts every job on an office TV board. I also trained the team that uses it, so the system runs without me in the loop.</w:t>
+        <w:t>Corporate task platform · foundation with schools in 66 countries · Mar 2026 to present · in production</w:t>
       </w:r>
     </w:p>
     <w:p>
       <w:pPr>
-        <w:keepNext w:val="0"/>
-        <w:spacing w:after="120" w:before="0"/>
-        <w:ind w:left="283"/>
+        <w:jc w:val="left"/>
       </w:pPr>
       <w:r>
-        <w:rPr>
-          <w:rFonts w:ascii="Georgia" w:hAnsi="Georgia"/>
-          <w:b w:val="0"/>
-          <w:i/>
-          <w:color w:val="1A1A1A"/>
-          <w:sz w:val="20"/>
-        </w:rPr>
-        <w:t xml:space="preserve">Obstacle: </w:t>
-      </w:r>
-      <w:r>
-        <w:rPr>
-          <w:rFonts w:ascii="Georgia" w:hAnsi="Georgia"/>
-          <w:b w:val="0"/>
-          <w:i w:val="0"/>
-          <w:color w:val="1A1A1A"/>
-          <w:sz w:val="20"/>
-        </w:rPr>
-        <w:t>generated documents drifted from the institution's templates and a text diff showed nothing, because the drift was visual; comparing delivered files against fixed templates visually made template stability measurable.</w:t>
+        <w:t>The department head used to read every incoming request, decide who should handle it, and track delivery himself, for a team of 15. The platform ingests the mailbox, turns each message into a structured task with an LLM, assigns it, and displays the queue on an office board. Next.js, React, Supabase. Twelve of the department's fourteen internal applications are live and in daily use.</w:t>
       </w:r>
     </w:p>
     <w:p>
       <w:pPr>
-        <w:keepNext/>
-        <w:spacing w:after="20" w:before="120"/>
+        <w:jc w:val="left"/>
       </w:pPr>
       <w:r>
-        <w:rPr>
-          <w:rFonts w:ascii="Georgia" w:hAnsi="Georgia"/>
-          <w:b/>
-          <w:i w:val="0"/>
-          <w:color w:val="1A1A1A"/>
-          <w:sz w:val="21"/>
-        </w:rPr>
-        <w:t>Rıfkı, an ESP32-S3 desktop robot</w:t>
+        <w:t>Obstacle: generated documents drifted from institutional templates and a text diff showed nothing, because the drift was visual. Comparing delivered files against fixed templates visually made template stability measurable.</w:t>
       </w:r>
     </w:p>
     <w:p>
       <w:pPr>
-        <w:keepNext/>
-        <w:spacing w:after="60" w:before="0"/>
+        <w:jc w:val="left"/>
       </w:pPr>
       <w:r>
-        <w:rPr>
-          <w:rFonts w:ascii="Georgia" w:hAnsi="Georgia"/>
-          <w:b w:val="0"/>
-          <w:i w:val="0"/>
-          <w:color w:val="555555"/>
-          <w:sz w:val="18"/>
-        </w:rPr>
-        <w:t>personal project · Istanbul · Apr 2026 to present · working prototype</w:t>
+        <w:t>guard-20 and audit-20 · open source · Jul 2026 to present · installed by other developers</w:t>
       </w:r>
     </w:p>
     <w:p>
       <w:pPr>
-        <w:keepNext w:val="0"/>
-        <w:spacing w:after="60" w:before="0"/>
+        <w:jc w:val="left"/>
       </w:pPr>
       <w:r>
-        <w:rPr>
-          <w:rFonts w:ascii="Georgia" w:hAnsi="Georgia"/>
-          <w:b w:val="0"/>
-          <w:i w:val="0"/>
-          <w:color w:val="1A1A1A"/>
-          <w:sz w:val="20"/>
-        </w:rPr>
-        <w:t>Microphone to speech recognition to an LLM to speech synthesis to head and arm servos, with wake word detection and over the air updates.</w:t>
+        <w:t>Verification tooling for AI-generated code: rules that apply while the model writes, and a twenty-pass gate before delivery. github.com/kasparovabi</w:t>
       </w:r>
     </w:p>
     <w:p>
       <w:pPr>
-        <w:keepNext w:val="0"/>
-        <w:spacing w:after="120" w:before="0"/>
-        <w:ind w:left="283"/>
+        <w:jc w:val="left"/>
       </w:pPr>
       <w:r>
-        <w:rPr>
-          <w:rFonts w:ascii="Georgia" w:hAnsi="Georgia"/>
-          <w:b w:val="0"/>
-          <w:i/>
-          <w:color w:val="1A1A1A"/>
-          <w:sz w:val="20"/>
-        </w:rPr>
-        <w:t xml:space="preserve">Obstacle: </w:t>
-      </w:r>
-      <w:r>
-        <w:rPr>
-          <w:rFonts w:ascii="Georgia" w:hAnsi="Georgia"/>
-          <w:b w:val="0"/>
-          <w:i w:val="0"/>
-          <w:color w:val="1A1A1A"/>
-          <w:sz w:val="20"/>
-        </w:rPr>
-        <w:t>on battery the board browned out and boot looped for a month. My first guess, that the servos stay passive during boot, was wrong: watching the hardware showed them twitching the instant the battery goes in. Floating pins at reset drew enough inrush to take the rail under its brownout threshold, and holding them low in the first line of the constructor fixed it without touching the hardware.</w:t>
+        <w:t>Demand and listing engine · own production business · Jun 2026 to present · running daily</w:t>
       </w:r>
     </w:p>
     <w:p>
       <w:pPr>
-        <w:keepNext/>
-        <w:spacing w:after="20" w:before="120"/>
+        <w:jc w:val="left"/>
       </w:pPr>
       <w:r>
-        <w:rPr>
-          <w:rFonts w:ascii="Georgia" w:hAnsi="Georgia"/>
-          <w:b/>
-          <w:i w:val="0"/>
-          <w:color w:val="1A1A1A"/>
-          <w:sz w:val="21"/>
-        </w:rPr>
-        <w:t>Etsy Factory and Demand Engine</w:t>
+        <w:t>Public-domain works and generated art become products and marketplace listings through a Telegram approval gate, on a schedule. A pricing engine pulls the fulfilment shipping table per variant and country and disables combinations that cannot be profitable.</w:t>
       </w:r>
     </w:p>
     <w:p>
       <w:pPr>
-        <w:keepNext/>
-        <w:spacing w:after="60" w:before="0"/>
+        <w:jc w:val="left"/>
       </w:pPr>
       <w:r>
-        <w:rPr>
-          <w:rFonts w:ascii="Georgia" w:hAnsi="Georgia"/>
-          <w:b w:val="0"/>
-          <w:i w:val="0"/>
-          <w:color w:val="555555"/>
-          <w:sz w:val="18"/>
-        </w:rPr>
-        <w:t>own production business · remote · Jun 2026 to present · running daily</w:t>
+        <w:t>Obstacle: agents kept producing near-duplicate ideas. The model was the obvious suspect and swapping it changed nothing; the cause was the shape of the data handed to them. The clearest case I have of an AI failure that is not an AI problem.</w:t>
       </w:r>
     </w:p>
     <w:p>
       <w:pPr>
-        <w:keepNext w:val="0"/>
-        <w:spacing w:after="60" w:before="0"/>
+        <w:jc w:val="left"/>
       </w:pPr>
       <w:r>
-        <w:rPr>
-          <w:rFonts w:ascii="Georgia" w:hAnsi="Georgia"/>
-          <w:b w:val="0"/>
-          <w:i w:val="0"/>
-          <w:color w:val="1A1A1A"/>
-          <w:sz w:val="20"/>
-        </w:rPr>
-        <w:t>Public domain museum works and locally generated art become Printify products and Etsy listings through a Telegram approval gate, on a schedule, driven from my phone. A pricing engine pulls Printify's shipping table per variant and country and disables combinations that cannot be profitable.</w:t>
+        <w:t>Multilingual content platform · Jun 2026 to present · running daily</w:t>
       </w:r>
     </w:p>
     <w:p>
       <w:pPr>
-        <w:keepNext w:val="0"/>
-        <w:spacing w:after="120" w:before="0"/>
-        <w:ind w:left="283"/>
+        <w:jc w:val="left"/>
       </w:pPr>
       <w:r>
-        <w:rPr>
-          <w:rFonts w:ascii="Georgia" w:hAnsi="Georgia"/>
-          <w:b w:val="0"/>
-          <w:i/>
-          <w:color w:val="1A1A1A"/>
-          <w:sz w:val="20"/>
-        </w:rPr>
-        <w:t xml:space="preserve">Obstacle: </w:t>
-      </w:r>
-      <w:r>
-        <w:rPr>
-          <w:rFonts w:ascii="Georgia" w:hAnsi="Georgia"/>
-          <w:b w:val="0"/>
-          <w:i w:val="0"/>
-          <w:color w:val="1A1A1A"/>
-          <w:sz w:val="20"/>
-        </w:rPr>
-        <w:t>the agents kept producing near duplicate ideas. The model was the obvious suspect and changing it changed nothing; the cause was the shape of the data handed to them, which is the clearest case I have of an AI failure that is not an AI problem.</w:t>
+        <w:t>Assistant infrastructure with persistent memory and 13 scheduled jobs, chaining research, generation, media production and publishing. Generated text is checked automatically against a written style specification before it can ship. Runs on AWS inside a Tailscale private network.</w:t>
       </w:r>
     </w:p>
     <w:p>
       <w:pPr>
-        <w:keepNext/>
-        <w:spacing w:after="20" w:before="120"/>
+        <w:jc w:val="left"/>
       </w:pPr>
       <w:r>
-        <w:rPr>
-          <w:rFonts w:ascii="Georgia" w:hAnsi="Georgia"/>
-          <w:b/>
-          <w:i w:val="0"/>
-          <w:color w:val="1A1A1A"/>
-          <w:sz w:val="21"/>
-        </w:rPr>
-        <w:t>Cebimde Claude</w:t>
+        <w:t>Distributed render pipeline · Feb 2026 to present · in production</w:t>
       </w:r>
     </w:p>
     <w:p>
       <w:pPr>
-        <w:keepNext/>
-        <w:spacing w:after="60" w:before="0"/>
+        <w:jc w:val="left"/>
       </w:pPr>
       <w:r>
+        <w:t>Parametric video rendering where theme, camera movement and event data are parameters and jobs are processed from a queue. Orchestration on macOS, GPU-bound work on Windows, connected over a private network. Over 3,600 files, actively developed.</w:t>
+      </w:r>
+    </w:p>
+    <w:p>
+      <w:r>
         <w:rPr>
-          <w:rFonts w:ascii="Georgia" w:hAnsi="Georgia"/>
-          <w:b w:val="0"/>
-          <w:i w:val="0"/>
-          <w:color w:val="555555"/>
-          <w:sz w:val="18"/>
+          <w:b/>
+          <w:color w:val="1A1A1A"/>
+          <w:sz w:val="24"/>
         </w:rPr>
-        <w:t>personal project · remote · Jun 2026 · building iOS apps from the phone, without sitting at a Mac</w:t>
+        <w:t>STACK</w:t>
       </w:r>
     </w:p>
     <w:p>
       <w:pPr>
-        <w:keepNext w:val="0"/>
-        <w:spacing w:after="60" w:before="0"/>
+        <w:jc w:val="left"/>
       </w:pPr>
       <w:r>
-        <w:rPr>
-          <w:rFonts w:ascii="Georgia" w:hAnsi="Georgia"/>
-          <w:b w:val="0"/>
-          <w:i w:val="0"/>
-          <w:color w:val="1A1A1A"/>
-          <w:sz w:val="20"/>
-        </w:rPr>
-        <w:t>The Mac becomes a build server you never look at: you describe the app from your phone, the agent scaffolds a SwiftUI project, compiles it, and a second command signs and installs it on the device in your hand. Failed builds go back to the agent, which fixes and rebuilds unprompted.</w:t>
+        <w:t>Languages: Python, TypeScript, JavaScript, SQL, Shell, Swift, C++</w:t>
       </w:r>
     </w:p>
     <w:p>
       <w:pPr>
-        <w:keepNext w:val="0"/>
-        <w:spacing w:after="120" w:before="0"/>
-        <w:ind w:left="283"/>
+        <w:jc w:val="left"/>
       </w:pPr>
       <w:r>
-        <w:rPr>
-          <w:rFonts w:ascii="Georgia" w:hAnsi="Georgia"/>
-          <w:b w:val="0"/>
-          <w:i/>
-          <w:color w:val="1A1A1A"/>
-          <w:sz w:val="20"/>
-        </w:rPr>
-        <w:t xml:space="preserve">Obstacle: </w:t>
-      </w:r>
-      <w:r>
-        <w:rPr>
-          <w:rFonts w:ascii="Georgia" w:hAnsi="Georgia"/>
-          <w:b w:val="0"/>
-          <w:i w:val="0"/>
-          <w:color w:val="1A1A1A"/>
-          <w:sz w:val="20"/>
-        </w:rPr>
-        <w:t>dropped connections left ghost agents writing to dead sockets; a connection epoch and a per project stop rule closed it.</w:t>
+        <w:t>Agent and LLM: Claude Agent SDK, MCP servers, OpenRouter, Ollama, RAG pipelines, prompt and context distribution tooling</w:t>
       </w:r>
     </w:p>
     <w:p>
       <w:pPr>
-        <w:keepNext/>
-        <w:spacing w:after="20" w:before="120"/>
+        <w:jc w:val="left"/>
       </w:pPr>
       <w:r>
-        <w:rPr>
-          <w:rFonts w:ascii="Georgia" w:hAnsi="Georgia"/>
-          <w:b/>
-          <w:i w:val="0"/>
-          <w:color w:val="1A1A1A"/>
-          <w:sz w:val="21"/>
-        </w:rPr>
-        <w:t>guard-20 and audit-20</w:t>
+        <w:t>Backend and data: FastAPI, SQLAlchemy, PostgreSQL, SQLite, Supabase, Prisma, REST API integration</w:t>
       </w:r>
     </w:p>
     <w:p>
       <w:pPr>
-        <w:keepNext/>
-        <w:spacing w:after="60" w:before="0"/>
+        <w:jc w:val="left"/>
       </w:pPr>
       <w:r>
-        <w:rPr>
-          <w:rFonts w:ascii="Georgia" w:hAnsi="Georgia"/>
-          <w:b w:val="0"/>
-          <w:i w:val="0"/>
-          <w:color w:val="555555"/>
-          <w:sz w:val="18"/>
-        </w:rPr>
-        <w:t>open source · remote · Jul 2026 to present · github.com/kasparovabi · installed by other developers</w:t>
+        <w:t>Cloud and infrastructure: AWS, Cloudflare Workers, Docker, Tailscale, launchd and cron, GitHub Actions, headless CI</w:t>
       </w:r>
     </w:p>
     <w:p>
       <w:pPr>
-        <w:keepNext w:val="0"/>
-        <w:spacing w:after="60" w:before="0"/>
+        <w:jc w:val="left"/>
       </w:pPr>
       <w:r>
-        <w:rPr>
-          <w:rFonts w:ascii="Georgia" w:hAnsi="Georgia"/>
-          <w:b w:val="0"/>
-          <w:i w:val="0"/>
-          <w:color w:val="1A1A1A"/>
-          <w:sz w:val="20"/>
-        </w:rPr>
-        <w:t>Twenty recurring failure classes in AI generated code, turned into process that runs by itself: rules that apply while the model writes, and a twenty pass verification gate whose last pass exists only to falsify the previous nineteen.</w:t>
+        <w:t>Frontend: Next.js, React, Tailwind, SwiftUI</w:t>
       </w:r>
     </w:p>
     <w:p>
       <w:pPr>
-        <w:keepNext w:val="0"/>
-        <w:spacing w:after="120" w:before="0"/>
-        <w:ind w:left="283"/>
+        <w:jc w:val="left"/>
       </w:pPr>
       <w:r>
-        <w:rPr>
-          <w:rFonts w:ascii="Georgia" w:hAnsi="Georgia"/>
-          <w:b w:val="0"/>
-          <w:i/>
-          <w:color w:val="1A1A1A"/>
-          <w:sz w:val="20"/>
-        </w:rPr>
-        <w:t xml:space="preserve">Obstacle: </w:t>
-      </w:r>
-      <w:r>
-        <w:rPr>
-          <w:rFonts w:ascii="Georgia" w:hAnsi="Georgia"/>
-          <w:b w:val="0"/>
-          <w:i w:val="0"/>
-          <w:color w:val="1A1A1A"/>
-          <w:sz w:val="20"/>
-        </w:rPr>
-        <w:t>the gate made output worse on the newest model generation, which contradicted the whole premise. An evaluation harness running the same task with and without it showed the effect was real and model dependent, so the scaffold is now gated by model rather than always on.</w:t>
+        <w:t>Testing and evaluation: pytest, vitest, Playwright, XCTest, custom evaluation harnesses, golden-output comparison</w:t>
       </w:r>
     </w:p>
     <w:p>
       <w:pPr>
-        <w:pStyle w:val="Heading2"/>
+        <w:jc w:val="left"/>
       </w:pPr>
       <w:r>
-        <w:t>Stack</w:t>
+        <w:t>Integrations: Microsoft Graph and Outlook 365, Telegram, WhatsApp, marketplace and fulfilment APIs, Deepgram, ElevenLabs</w:t>
+      </w:r>
+    </w:p>
+    <w:p>
+      <w:r>
+        <w:rPr>
+          <w:b/>
+          <w:color w:val="1A1A1A"/>
+          <w:sz w:val="24"/>
+        </w:rPr>
+        <w:t>EXPERIENCE</w:t>
       </w:r>
     </w:p>
     <w:p>
       <w:pPr>
-        <w:keepNext w:val="0"/>
-        <w:spacing w:after="60" w:before="0"/>
+        <w:jc w:val="left"/>
       </w:pPr>
       <w:r>
-        <w:rPr>
-          <w:rFonts w:ascii="Georgia" w:hAnsi="Georgia"/>
-          <w:b/>
-          <w:i w:val="0"/>
-          <w:color w:val="1A1A1A"/>
-          <w:sz w:val="20"/>
-        </w:rPr>
-        <w:t xml:space="preserve">AI tooling: </w:t>
-      </w:r>
-      <w:r>
-        <w:rPr>
-          <w:rFonts w:ascii="Georgia" w:hAnsi="Georgia"/>
-          <w:b w:val="0"/>
-          <w:i w:val="0"/>
-          <w:color w:val="1A1A1A"/>
-          <w:sz w:val="20"/>
-        </w:rPr>
-        <w:t>Claude Code across a Windows and a macOS machine joined over Tailscale, Claude Agent SDK in my own applications, Codex CLI, Cursor, Antigravity, Gemini CLI, Ollama and OpenRouter for model routing, MCP servers for Blender and NotebookLM</w:t>
+        <w:t>AI Solutions Designer · Türkiye Maarif Vakfı · consulting engagement · Feb 2026 to present</w:t>
       </w:r>
     </w:p>
     <w:p>
       <w:pPr>
-        <w:keepNext w:val="0"/>
-        <w:spacing w:after="60" w:before="0"/>
+        <w:jc w:val="left"/>
       </w:pPr>
       <w:r>
-        <w:rPr>
-          <w:rFonts w:ascii="Georgia" w:hAnsi="Georgia"/>
-          <w:b/>
-          <w:i w:val="0"/>
-          <w:color w:val="1A1A1A"/>
-          <w:sz w:val="20"/>
-        </w:rPr>
-        <w:t xml:space="preserve">Code: </w:t>
-      </w:r>
-      <w:r>
-        <w:rPr>
-          <w:rFonts w:ascii="Georgia" w:hAnsi="Georgia"/>
-          <w:b w:val="0"/>
-          <w:i w:val="0"/>
-          <w:color w:val="1A1A1A"/>
-          <w:sz w:val="20"/>
-        </w:rPr>
-        <w:t>Python, TypeScript, JavaScript, Swift, C++ (ESP32/Arduino), C#, SQL, Shell</w:t>
+        <w:t>Generative AI Engineer · Pepper Root, Creative AI Studio · remote · Nov 2025 to Jan 2026</w:t>
       </w:r>
     </w:p>
     <w:p>
       <w:pPr>
-        <w:keepNext w:val="0"/>
-        <w:spacing w:after="60" w:before="0"/>
+        <w:jc w:val="left"/>
       </w:pPr>
       <w:r>
-        <w:rPr>
-          <w:rFonts w:ascii="Georgia" w:hAnsi="Georgia"/>
-          <w:b/>
-          <w:i w:val="0"/>
-          <w:color w:val="1A1A1A"/>
-          <w:sz w:val="20"/>
-        </w:rPr>
-        <w:t xml:space="preserve">Backend and data: </w:t>
-      </w:r>
-      <w:r>
-        <w:rPr>
-          <w:rFonts w:ascii="Georgia" w:hAnsi="Georgia"/>
-          <w:b w:val="0"/>
-          <w:i w:val="0"/>
-          <w:color w:val="1A1A1A"/>
-          <w:sz w:val="20"/>
-        </w:rPr>
-        <w:t>FastAPI, SQLAlchemy, SQLite, PostgreSQL, Prisma, Supabase</w:t>
+        <w:t>AI Artist · Joy Game · Istanbul · Aug 2025 to Oct 2025</w:t>
       </w:r>
     </w:p>
     <w:p>
       <w:pPr>
-        <w:keepNext w:val="0"/>
-        <w:spacing w:after="60" w:before="0"/>
+        <w:jc w:val="left"/>
       </w:pPr>
       <w:r>
-        <w:rPr>
-          <w:rFonts w:ascii="Georgia" w:hAnsi="Georgia"/>
-          <w:b/>
-          <w:i w:val="0"/>
-          <w:color w:val="1A1A1A"/>
-          <w:sz w:val="20"/>
-        </w:rPr>
-        <w:t xml:space="preserve">Frontend and apps: </w:t>
-      </w:r>
-      <w:r>
-        <w:rPr>
-          <w:rFonts w:ascii="Georgia" w:hAnsi="Georgia"/>
-          <w:b w:val="0"/>
-          <w:i w:val="0"/>
-          <w:color w:val="1A1A1A"/>
-          <w:sz w:val="20"/>
-        </w:rPr>
-        <w:t>Next.js, React, Tailwind, SwiftUI, Capacitor, Tauri, PySide6</w:t>
+        <w:t>Chief GenAI Art Director · GPT Journey · Istanbul · Mar 2024 to Aug 2025</w:t>
       </w:r>
     </w:p>
     <w:p>
       <w:pPr>
-        <w:keepNext w:val="0"/>
-        <w:spacing w:after="60" w:before="0"/>
+        <w:jc w:val="left"/>
       </w:pPr>
       <w:r>
-        <w:rPr>
-          <w:rFonts w:ascii="Georgia" w:hAnsi="Georgia"/>
-          <w:b/>
-          <w:i w:val="0"/>
-          <w:color w:val="1A1A1A"/>
-          <w:sz w:val="20"/>
-        </w:rPr>
-        <w:t xml:space="preserve">Embedded and infra: </w:t>
-      </w:r>
-      <w:r>
-        <w:rPr>
-          <w:rFonts w:ascii="Georgia" w:hAnsi="Georgia"/>
-          <w:b w:val="0"/>
-          <w:i w:val="0"/>
-          <w:color w:val="1A1A1A"/>
-          <w:sz w:val="20"/>
-        </w:rPr>
-        <w:t>ESP-IDF, PlatformIO, Arduino, Git, Docker, Vercel, Netlify, Cloudflare Workers, Tailscale, launchd and cron</w:t>
+        <w:t>Generative AI Creator · Fiverr · remote · Oct 2022 to Jun 2025</w:t>
       </w:r>
     </w:p>
     <w:p>
       <w:pPr>
-        <w:keepNext w:val="0"/>
-        <w:spacing w:after="60" w:before="0"/>
+        <w:jc w:val="left"/>
       </w:pPr>
       <w:r>
-        <w:rPr>
-          <w:rFonts w:ascii="Georgia" w:hAnsi="Georgia"/>
-          <w:b/>
-          <w:i w:val="0"/>
-          <w:color w:val="1A1A1A"/>
-          <w:sz w:val="20"/>
-        </w:rPr>
-        <w:t xml:space="preserve">Integrations: </w:t>
-      </w:r>
-      <w:r>
-        <w:rPr>
-          <w:rFonts w:ascii="Georgia" w:hAnsi="Georgia"/>
-          <w:b w:val="0"/>
-          <w:i w:val="0"/>
-          <w:color w:val="1A1A1A"/>
-          <w:sz w:val="20"/>
-        </w:rPr>
-        <w:t>REST APIs, Microsoft Graph and Outlook 365, Etsy, Printify, Telegram, WhatsApp, Deepgram, ElevenLabs, Groq, KIE.AI</w:t>
+        <w:t>Education: Mechanical Engineering, Namık Kemal University, from 2012, left before finishing. Ten years in visual production before software.</w:t>
       </w:r>
     </w:p>
     <w:p>
       <w:pPr>
-        <w:keepNext w:val="0"/>
-        <w:spacing w:after="60" w:before="0"/>
+        <w:jc w:val="left"/>
       </w:pPr>
       <w:r>
-        <w:rPr>
-          <w:rFonts w:ascii="Georgia" w:hAnsi="Georgia"/>
-          <w:b/>
-          <w:i w:val="0"/>
-          <w:color w:val="1A1A1A"/>
-          <w:sz w:val="20"/>
-        </w:rPr>
-        <w:t xml:space="preserve">Testing: </w:t>
-      </w:r>
-      <w:r>
-        <w:rPr>
-          <w:rFonts w:ascii="Georgia" w:hAnsi="Georgia"/>
-          <w:b w:val="0"/>
-          <w:i w:val="0"/>
-          <w:color w:val="1A1A1A"/>
-          <w:sz w:val="20"/>
-        </w:rPr>
-        <w:t>pytest, vitest, Jest, XCTest, Playwright, headless batchmode CI</w:t>
-      </w:r>
-    </w:p>
-    <w:p>
-      <w:pPr>
-        <w:pStyle w:val="Heading2"/>
-      </w:pPr>
-      <w:r>
-        <w:t>Experience and education</w:t>
-      </w:r>
-    </w:p>
-    <w:p>
-      <w:pPr>
-        <w:keepNext w:val="0"/>
-        <w:spacing w:after="60" w:before="0"/>
-      </w:pPr>
-      <w:r>
-        <w:rPr>
-          <w:rFonts w:ascii="Georgia" w:hAnsi="Georgia"/>
-          <w:b/>
-          <w:i w:val="0"/>
-          <w:color w:val="1A1A1A"/>
-          <w:sz w:val="20"/>
-        </w:rPr>
-        <w:t>AI Solutions Designer</w:t>
-      </w:r>
-      <w:r>
-        <w:rPr>
-          <w:rFonts w:ascii="Georgia" w:hAnsi="Georgia"/>
-          <w:b w:val="0"/>
-          <w:i w:val="0"/>
-          <w:color w:val="555555"/>
-          <w:sz w:val="20"/>
-        </w:rPr>
-        <w:t xml:space="preserve">  ·  Türkiye Maarif Vakfı  ·  Istanbul, consulting engagement  ·  Feb 2026 to present</w:t>
-      </w:r>
-    </w:p>
-    <w:p>
-      <w:pPr>
-        <w:keepNext w:val="0"/>
-        <w:spacing w:after="60" w:before="0"/>
-      </w:pPr>
-      <w:r>
-        <w:rPr>
-          <w:rFonts w:ascii="Georgia" w:hAnsi="Georgia"/>
-          <w:b/>
-          <w:i w:val="0"/>
-          <w:color w:val="1A1A1A"/>
-          <w:sz w:val="20"/>
-        </w:rPr>
-        <w:t>Generative AI Engineer</w:t>
-      </w:r>
-      <w:r>
-        <w:rPr>
-          <w:rFonts w:ascii="Georgia" w:hAnsi="Georgia"/>
-          <w:b w:val="0"/>
-          <w:i w:val="0"/>
-          <w:color w:val="555555"/>
-          <w:sz w:val="20"/>
-        </w:rPr>
-        <w:t xml:space="preserve">  ·  Pepper Root, Creative AI Studio  ·  remote  ·  Nov 2025 to Jan 2026</w:t>
-      </w:r>
-    </w:p>
-    <w:p>
-      <w:pPr>
-        <w:keepNext w:val="0"/>
-        <w:spacing w:after="60" w:before="0"/>
-      </w:pPr>
-      <w:r>
-        <w:rPr>
-          <w:rFonts w:ascii="Georgia" w:hAnsi="Georgia"/>
-          <w:b/>
-          <w:i w:val="0"/>
-          <w:color w:val="1A1A1A"/>
-          <w:sz w:val="20"/>
-        </w:rPr>
-        <w:t>AI Artist</w:t>
-      </w:r>
-      <w:r>
-        <w:rPr>
-          <w:rFonts w:ascii="Georgia" w:hAnsi="Georgia"/>
-          <w:b w:val="0"/>
-          <w:i w:val="0"/>
-          <w:color w:val="555555"/>
-          <w:sz w:val="20"/>
-        </w:rPr>
-        <w:t xml:space="preserve">  ·  Joy Game  ·  Istanbul  ·  Aug 2025 to Oct 2025</w:t>
-      </w:r>
-    </w:p>
-    <w:p>
-      <w:pPr>
-        <w:keepNext w:val="0"/>
-        <w:spacing w:after="60" w:before="0"/>
-      </w:pPr>
-      <w:r>
-        <w:rPr>
-          <w:rFonts w:ascii="Georgia" w:hAnsi="Georgia"/>
-          <w:b/>
-          <w:i w:val="0"/>
-          <w:color w:val="1A1A1A"/>
-          <w:sz w:val="20"/>
-        </w:rPr>
-        <w:t>Chief GenAI Art Director</w:t>
-      </w:r>
-      <w:r>
-        <w:rPr>
-          <w:rFonts w:ascii="Georgia" w:hAnsi="Georgia"/>
-          <w:b w:val="0"/>
-          <w:i w:val="0"/>
-          <w:color w:val="555555"/>
-          <w:sz w:val="20"/>
-        </w:rPr>
-        <w:t xml:space="preserve">  ·  GPT Journey  ·  Istanbul  ·  Mar 2024 to Aug 2025</w:t>
-      </w:r>
-    </w:p>
-    <w:p>
-      <w:pPr>
-        <w:keepNext w:val="0"/>
-        <w:spacing w:after="60" w:before="0"/>
-      </w:pPr>
-      <w:r>
-        <w:rPr>
-          <w:rFonts w:ascii="Georgia" w:hAnsi="Georgia"/>
-          <w:b/>
-          <w:i w:val="0"/>
-          <w:color w:val="1A1A1A"/>
-          <w:sz w:val="20"/>
-        </w:rPr>
-        <w:t>Generative AI Creator</w:t>
-      </w:r>
-      <w:r>
-        <w:rPr>
-          <w:rFonts w:ascii="Georgia" w:hAnsi="Georgia"/>
-          <w:b w:val="0"/>
-          <w:i w:val="0"/>
-          <w:color w:val="555555"/>
-          <w:sz w:val="20"/>
-        </w:rPr>
-        <w:t xml:space="preserve">  ·  Fiverr  ·  remote  ·  Oct 2022 to Jun 2025</w:t>
-      </w:r>
-    </w:p>
-    <w:p>
-      <w:pPr>
-        <w:keepNext w:val="0"/>
-        <w:spacing w:after="120" w:before="80"/>
-      </w:pPr>
-      <w:r>
-        <w:rPr>
-          <w:rFonts w:ascii="Georgia" w:hAnsi="Georgia"/>
-          <w:b/>
-          <w:i w:val="0"/>
-          <w:color w:val="1A1A1A"/>
-          <w:sz w:val="20"/>
-        </w:rPr>
-        <w:t xml:space="preserve">Education: </w:t>
-      </w:r>
-      <w:r>
-        <w:rPr>
-          <w:rFonts w:ascii="Georgia" w:hAnsi="Georgia"/>
-          <w:b w:val="0"/>
-          <w:i w:val="0"/>
-          <w:color w:val="1A1A1A"/>
-          <w:sz w:val="20"/>
-        </w:rPr>
-        <w:t>Mechanical Engineering, Namık Kemal University from 2012, left before finishing. Ten years in visual production before software, running Stable Diffusion and ComfyUI on my own machines from 2023.</w:t>
-      </w:r>
-    </w:p>
-    <w:p>
-      <w:pPr>
-        <w:keepNext w:val="0"/>
-        <w:spacing w:after="120" w:before="0"/>
-      </w:pPr>
-      <w:r>
-        <w:rPr>
-          <w:rFonts w:ascii="Georgia" w:hAnsi="Georgia"/>
-          <w:b/>
-          <w:i w:val="0"/>
-          <w:color w:val="1A1A1A"/>
-          <w:sz w:val="20"/>
-        </w:rPr>
-        <w:t xml:space="preserve">Languages: </w:t>
-      </w:r>
-      <w:r>
-        <w:rPr>
-          <w:rFonts w:ascii="Georgia" w:hAnsi="Georgia"/>
-          <w:b w:val="0"/>
-          <w:i w:val="0"/>
-          <w:color w:val="1A1A1A"/>
-          <w:sz w:val="20"/>
-        </w:rPr>
-        <w:t>Turkish (native), English (professional)</w:t>
+        <w:t>Languages: Turkish (native), English (professional)</w:t>
       </w:r>
     </w:p>
     <w:sectPr>
       <w:pgSz w:w="12240" w:h="15840"/>
-      <w:pgMar w:top="907" w:right="1077" w:bottom="907" w:left="1077" w:header="720" w:footer="720" w:gutter="0"/>
+      <w:pgMar w:top="1440" w:right="1800" w:bottom="1440" w:left="1800" w:header="720" w:footer="720" w:gutter="0"/>
       <w:cols w:space="720"/>
       <w:docGrid w:linePitch="360"/>
     </w:sectPr>
@@ -1304,12 +785,8 @@
     <w:name w:val="Normal"/>
     <w:qFormat/>
     <w:rsid w:val="00FC693F"/>
-    <w:pPr>
-      <w:spacing w:after="120" w:before="0" w:line="259" w:lineRule="auto"/>
-    </w:pPr>
     <w:rPr>
-      <w:rFonts w:ascii="Georgia" w:hAnsi="Georgia"/>
-      <w:color w:val="1A1A1A"/>
+      <w:rFonts w:ascii="Calibri" w:hAnsi="Calibri"/>
       <w:sz w:val="20"/>
     </w:rPr>
   </w:style>
@@ -1368,15 +845,15 @@
     <w:pPr>
       <w:keepNext/>
       <w:keepLines/>
-      <w:spacing w:before="0" w:after="40"/>
+      <w:spacing w:before="480" w:after="0"/>
       <w:outlineLvl w:val="0"/>
     </w:pPr>
     <w:rPr>
-      <w:rFonts w:asciiTheme="majorHAnsi" w:eastAsiaTheme="majorEastAsia" w:hAnsiTheme="majorHAnsi" w:cstheme="majorBidi" w:ascii="Georgia" w:hAnsi="Georgia" w:cs="Georgia"/>
+      <w:rFonts w:asciiTheme="majorHAnsi" w:eastAsiaTheme="majorEastAsia" w:hAnsiTheme="majorHAnsi" w:cstheme="majorBidi"/>
       <w:b/>
       <w:bCs/>
-      <w:color w:val="1A1A1A"/>
-      <w:sz w:val="40"/>
+      <w:color w:val="365F91" w:themeColor="accent1" w:themeShade="BF"/>
+      <w:sz w:val="28"/>
       <w:szCs w:val="28"/>
     </w:rPr>
   </w:style>
@@ -1392,18 +869,15 @@
     <w:pPr>
       <w:keepNext/>
       <w:keepLines/>
-      <w:spacing w:before="240" w:after="100"/>
+      <w:spacing w:before="200" w:after="0"/>
       <w:outlineLvl w:val="1"/>
-      <w:pBdr>
-        <w:bottom w:val="single" w:sz="6" w:space="3" w:color="B9A888"/>
-      </w:pBdr>
     </w:pPr>
     <w:rPr>
-      <w:rFonts w:asciiTheme="majorHAnsi" w:eastAsiaTheme="majorEastAsia" w:hAnsiTheme="majorHAnsi" w:cstheme="majorBidi" w:ascii="Georgia" w:hAnsi="Georgia" w:cs="Georgia"/>
+      <w:rFonts w:asciiTheme="majorHAnsi" w:eastAsiaTheme="majorEastAsia" w:hAnsiTheme="majorHAnsi" w:cstheme="majorBidi"/>
       <w:b/>
       <w:bCs/>
-      <w:color w:val="8A5322"/>
-      <w:sz w:val="22"/>
+      <w:color w:val="4F81BD" w:themeColor="accent1"/>
+      <w:sz w:val="26"/>
       <w:szCs w:val="26"/>
     </w:rPr>
   </w:style>

</xml_diff>

<commit_message>
Retarget the downloadable CV to match the site
The page said AI Automation Engineer while the PDF behind the download
button said AI Platform Engineer, Agent Infrastructure, Evaluation and
Governance, which was written for one specific job posting. A reader who
downloaded it met a different claim than the one they had just read.

Title and summary now match the site. The platform-and-governance framing is
gone as a frame, though the underlying work is still described. Sections are
Automation and agent work, Selected systems, Experience, Stack, Education.

Audited against a general posting for the role the site targets: parsing
100/100, keyword coverage 100 percent with 16 of 16 terms, no keyword
stuffing. Both PDF and Word regenerated.
</commit_message>
<xml_diff>
--- a/Ahmet-Kazankaya-CV.docx
+++ b/Ahmet-Kazankaya-CV.docx
@@ -15,7 +15,7 @@
         <w:jc w:val="left"/>
       </w:pPr>
       <w:r>
-        <w:t>AI PLATFORM ENGINEER · AGENT INFRASTRUCTURE, EVALUATION AND GOVERNANCE</w:t>
+        <w:t>AI AUTOMATION ENGINEER · LLM AGENT SYSTEMS, WORKFLOW AUTOMATION, PYTHON</w:t>
       </w:r>
     </w:p>
     <w:p>
@@ -23,7 +23,7 @@
         <w:jc w:val="left"/>
       </w:pPr>
       <w:r>
-        <w:t>Istanbul, Turkey · open to relocation in Europe, remote works too</w:t>
+        <w:t>Istanbul, Turkey · open to relocation in Europe, remote works too  ·  ahmetkazankaya1@gmail.com · +90 536 214 8114 ·</w:t>
       </w:r>
     </w:p>
     <w:p>
@@ -31,7 +31,7 @@
         <w:jc w:val="left"/>
       </w:pPr>
       <w:r>
-        <w:t>ahmetkazankaya1@gmail.com · +90 536 214 8114 · linkedin.com/in/ahmetkazankaya · github.com/kasparovabi</w:t>
+        <w:t>linkedin.com/in/ahmetkazankaya · github.com/kasparovabi</w:t>
       </w:r>
     </w:p>
     <w:p>
@@ -49,7 +49,7 @@
         <w:jc w:val="left"/>
       </w:pPr>
       <w:r>
-        <w:t>I build the platform layer that makes LLM agent workflows run reliably in production: execution runtimes, human approval gates, permission boundaries, run logging and the evaluation harnesses that decide whether an agent is allowed to ship. I own the architecture end to end, from the first design decision to the pager. I came to software through production work rather than a computer science degree, and my process assumes model output is wrong until something independent proves otherwise.</w:t>
+        <w:t>I build LLM agent systems and workflow automation that run in production, not in demos. That means Python services, data pipelines, third-party API integrations, orchestration with retries and human approval steps, and the evaluation harnesses and CI gates that decide whether an agent is allowed to ship. I own systems end to end, from the first design decision to the pager. I came to software through production work rather than a computer science degree, and my process assumes model output is wrong until something independent proves otherwise.</w:t>
       </w:r>
     </w:p>
     <w:p>
@@ -57,7 +57,7 @@
         <w:jc w:val="left"/>
       </w:pPr>
       <w:r>
-        <w:t>Since February 2026 I have consulted for a foundation running schools in 66 countries, where I own the internal automation platforms used daily by non-engineering teams: 14 applications in six months, 12 of them live, running reliably at department scale without me in the loop. I also run the enablement, so the systems keep working without me in the loop. The LLM agents I develop run in production against real users and real money, not as prototypes. I create and maintain open source developer tools that other engineers install and run unchanged, and I ensure the same verification gates apply to my own work.</w:t>
+        <w:t>Since February 2026 I have consulted for a foundation running schools in 66 countries, where I own the internal automation platforms used by a communications directorate: request intake and assignment, CV screening, editorial PDF generation, and a parametric signage generator serving campuses in seven countries. Each replaced work that was previously done by hand.</w:t>
       </w:r>
     </w:p>
     <w:p>
@@ -67,15 +67,7 @@
           <w:color w:val="1A1A1A"/>
           <w:sz w:val="24"/>
         </w:rPr>
-        <w:t>PLATFORM AND RELIABILITY WORK</w:t>
-      </w:r>
-    </w:p>
-    <w:p>
-      <w:r>
-        <w:rPr>
-          <w:b/>
-        </w:rPr>
-        <w:t>Execution platform and durable workflows.</w:t>
+        <w:t>AUTOMATION AND AGENT WORK</w:t>
       </w:r>
     </w:p>
     <w:p>
@@ -83,15 +75,7 @@
         <w:jc w:val="left"/>
       </w:pPr>
       <w:r>
-        <w:t>Event-triggered pipelines with scheduled and webhook entry points, durable state in Postgres and SQLite, job queues, retry and catch-up logic. The platform enables non-engineers to trigger reliable AI workflows without touching the runtime, and I monitor every run for failure and drift. A watchdog re-triggers runs that silently failed, capped at 3 attempts per day so a broken job cannot loop forever, because a scheduled job that dies quietly is worse than one that errors loudly. Every run is logged end to end and traceable back to its inputs, and failed runs trigger rollback rather than leaving half-written state behind.</w:t>
-      </w:r>
-    </w:p>
-    <w:p>
-      <w:r>
-        <w:rPr>
-          <w:b/>
-        </w:rPr>
-        <w:t>Model-agnostic runtime and cost control.</w:t>
+        <w:t>Agent orchestration. I run a fleet of scheduled agents against my own repositories and against open source projects: 141 skill definitions loaded on demand, 13 cron jobs and 6 launchd agents. A daily security audit loop has run 9 consecutive days without intervention. Agents propose; they never send. Security reports, force pushes and anything touching production data stop at a human approval gate.</w:t>
       </w:r>
     </w:p>
     <w:p>
@@ -99,15 +83,7 @@
         <w:jc w:val="left"/>
       </w:pPr>
       <w:r>
-        <w:t>Each task routes to the cheapest model that can complete it, across Anthropic, OpenAI and local Ollama, through OpenRouter and provider SDKs. Token spend, latency and failure rates are tracked per run, so cost and reliability are observable rather than estimated. A CI check validates every model identifier in the codebase against the live provider API, 10 models verified per run, so a retired model can never reach production. I have contributed this check upstream to open source agent tooling.</w:t>
-      </w:r>
-    </w:p>
-    <w:p>
-      <w:r>
-        <w:rPr>
-          <w:b/>
-        </w:rPr>
-        <w:t>Evaluation layer.</w:t>
+        <w:t>Evaluation before shipping. Every agent-authored change passes a twenty-check CI gate covering correctness, security and regression before it reaches a pull request. Two of four findings my security loop produced this month were rejected by those gates before reaching a maintainer: one duplicated a published CVE, the other did not reproduce when I ran the code. That rejection rate is the argument for the gates.</w:t>
       </w:r>
     </w:p>
     <w:p>
@@ -115,15 +91,7 @@
         <w:jc w:val="left"/>
       </w:pPr>
       <w:r>
-        <w:t>audit-20 turns twenty recurring failure classes in AI-generated code into a CI gate of twenty behavioral checks that catches unreliable output during development rather than after release, with a final pass whose only job is to falsify the previous nineteen, plus a false-positive filter so real defects are not buried in noise. Safety-relevant classes are checked against golden outputs and monitored per run, so a safety regression fails the build instead of reaching a user. When the gate made output worse on a newer model generation, an evaluation harness running the same task 20 times with and without it proved the effect was real and model-dependent, so the scaffold is now gated by model rather than always on. That harness is the reason I trust the gate at all.</w:t>
-      </w:r>
-    </w:p>
-    <w:p>
-      <w:r>
-        <w:rPr>
-          <w:b/>
-        </w:rPr>
-        <w:t>Governance and least privilege.</w:t>
+        <w:t>Reliability work. A scheduled job failed silently for a day because the machine had no network on wake. The gap in the audit log is how I found it. I added a network precondition, a success stamp and an hourly recovery watchdog, then verified all three recovery paths rather than assuming them.</w:t>
       </w:r>
     </w:p>
     <w:p>
@@ -131,47 +99,7 @@
         <w:jc w:val="left"/>
       </w:pPr>
       <w:r>
-        <w:t>Governance mechanisms are built into the platform rather than written in a policy document. Risk tiers decide what needs review: high-risk actions require human approval, so nothing reaches a live storefront, a customer inbox or a public repository without a person approving it first. Access controls and secret management are enforced at the runtime boundary. Permissions are scoped per job with audit logging on every privileged call, tool access is granted per task rather than per agent, credentials are held outside the agent context, and infrastructure runs inside a Tailscale private network with no ports exposed to the internet. Restrictions are enforced by system design, not by prompts.</w:t>
-      </w:r>
-    </w:p>
-    <w:p>
-      <w:r>
-        <w:rPr>
-          <w:b/>
-        </w:rPr>
-        <w:t>Security research and coordinated disclosure.</w:t>
-      </w:r>
-    </w:p>
-    <w:p>
-      <w:pPr>
-        <w:jc w:val="left"/>
-      </w:pPr>
-      <w:r>
-        <w:t>Two coordinated disclosures against open-source AI tooling, both filed privately through the vendor's own channel with no working exploit published. The first covered 17 vulnerabilities in a wearable AI device backend, aggregate CVSS 10.0, including remote code execution, authentication bypass, SSRF and a hardcoded production key; the vendor's own hardening commit names that disclosure in its title, so the outcome is verifiable in their git history rather than only in my write-up. The second reported that a documented filesystem allowlist did not exist in the shipped Rust binary, so the hardening step the project told operators to take did nothing.</w:t>
-      </w:r>
-    </w:p>
-    <w:p>
-      <w:pPr>
-        <w:jc w:val="left"/>
-      </w:pPr>
-      <w:r>
-        <w:t>I reproduce every finding locally before reporting, and I check each one against already-published advisories first: one prepared report was dropped unsent because an existing CVE already covered it. Reporting less is part of the discipline, since a duplicate costs a maintainer the same time as a real bug. Full timeline and artifacts: github.com/kasparovabi/security-research</w:t>
-      </w:r>
-    </w:p>
-    <w:p>
-      <w:r>
-        <w:rPr>
-          <w:b/>
-        </w:rPr>
-        <w:t>User adoption and measurement.</w:t>
-      </w:r>
-    </w:p>
-    <w:p>
-      <w:pPr>
-        <w:jc w:val="left"/>
-      </w:pPr>
-      <w:r>
-        <w:t>Platforms are instrumented for usage, failure rates and cost, so impact across the organization is measurable rather than asserted. I ran one-to-one enablement for a team of 15 and am preparing a foundation-wide seminar, because adoption is the half of the work that decides whether any of it survives.</w:t>
+        <w:t>Workflow automation. Request intake that routes by learned assignment history, a CV screening pipeline in Python and Supabase, an email signature generator, a parametric signage generator producing print-ready SVG in Latin, Arabic and Cyrillic scripts, and editorial PDF generation from structured data. Each of these replaced a manual process, and each runs as a scheduled pipeline with automated checks rather than as a script someone remembers to run.</w:t>
       </w:r>
     </w:p>
     <w:p>
@@ -189,7 +117,7 @@
         <w:jc w:val="left"/>
       </w:pPr>
       <w:r>
-        <w:t>Corporate task platform · foundation with schools in 66 countries · Mar 2026 to present · in production</w:t>
+        <w:t>Task management platform. Internal requests arrived by email and in conversation with no way to see who was doing what. I built intake, automatic assignment and routing that learns which colleague handles which kind of work, serving a directorate of 20 people. Next.js, React, Supabase.</w:t>
       </w:r>
     </w:p>
     <w:p>
@@ -197,7 +125,7 @@
         <w:jc w:val="left"/>
       </w:pPr>
       <w:r>
-        <w:t>The department head used to read every incoming request, decide who should handle it, and track delivery himself, for a team of 15. The platform ingests the mailbox, turns each message into a structured task with an LLM, assigns it, and displays the queue on an office board. Next.js, React, Supabase. Twelve of the department's fourteen internal applications are live and in daily use.</w:t>
+        <w:t>Etsy factory and demand engine. A pipeline that takes a product from generation through mockup rendering to marketplace listing, with an approval gate that turns back anything failing brand or legal checks. Two marketplace API integrations, automated listing state reconciliation, and integration tests against recorded responses. Python, Etsy and Printify APIs, Telegram approval flow.</w:t>
       </w:r>
     </w:p>
     <w:p>
@@ -205,7 +133,7 @@
         <w:jc w:val="left"/>
       </w:pPr>
       <w:r>
-        <w:t>Obstacle: generated documents drifted from institutional templates and a text diff showed nothing, because the drift was visual. Comparing delivered files against fixed templates visually made template stability measurable.</w:t>
+        <w:t>Rifki, an ESP32-S3 speech device. Hardware, firmware and the speech pipeline. Diagnosed a month-old brownout by watching the board instead of the logs: three servos drawing inrush current at boot pulled a 3.3 V rail below its 2.43 V threshold, a failure that appeared only on battery and never on USB. Deepgram, ElevenLabs, ESP-IDF, C++.</w:t>
       </w:r>
     </w:p>
     <w:p>
@@ -213,7 +141,17 @@
         <w:jc w:val="left"/>
       </w:pPr>
       <w:r>
-        <w:t>guard-20 and audit-20 · open source · Jul 2026 to present · installed by other developers</w:t>
+        <w:t>Coordinated security disclosure. Two disclosures filed under coordinated policy against open source AI tooling, the most critical rated CVSS 10.0. The vendor's own fix commit for the first cites the disclosure by name, so the outcome is verifiable in their history rather than in my write-up. A third report was prepared and closed before sending because an existing CVE already covered it.</w:t>
+      </w:r>
+    </w:p>
+    <w:p>
+      <w:r>
+        <w:rPr>
+          <w:b/>
+          <w:color w:val="1A1A1A"/>
+          <w:sz w:val="24"/>
+        </w:rPr>
+        <w:t>EXPERIENCE</w:t>
       </w:r>
     </w:p>
     <w:p>
@@ -221,7 +159,15 @@
         <w:jc w:val="left"/>
       </w:pPr>
       <w:r>
-        <w:t>Verification tooling for AI-generated code: rules that apply while the model writes, and a twenty-pass gate before delivery. github.com/kasparovabi</w:t>
+        <w:t>AI Solutions Designer, consulting · Turkiye Maarif Vakfi · Mar 2026 to now</w:t>
+      </w:r>
+    </w:p>
+    <w:p>
+      <w:r>
+        <w:rPr>
+          <w:b/>
+        </w:rPr>
+        <w:t>Internal automation platforms for the Directorate of Communications.</w:t>
       </w:r>
     </w:p>
     <w:p>
@@ -229,7 +175,15 @@
         <w:jc w:val="left"/>
       </w:pPr>
       <w:r>
-        <w:t>Demand and listing engine · own production business · Jun 2026 to present · running daily</w:t>
+        <w:t>Generative AI Engineer · Pepper Root · Nov 2025 to Jan 2026</w:t>
+      </w:r>
+    </w:p>
+    <w:p>
+      <w:r>
+        <w:rPr>
+          <w:b/>
+        </w:rPr>
+        <w:t>Creative AI studio, remote.</w:t>
       </w:r>
     </w:p>
     <w:p>
@@ -237,7 +191,15 @@
         <w:jc w:val="left"/>
       </w:pPr>
       <w:r>
-        <w:t>Public-domain works and generated art become products and marketplace listings through a Telegram approval gate, on a schedule. A pricing engine pulls the fulfilment shipping table per variant and country and disables combinations that cannot be profitable.</w:t>
+        <w:t>AI Artist · Joy Game · Aug 2025 to Oct 2025</w:t>
+      </w:r>
+    </w:p>
+    <w:p>
+      <w:r>
+        <w:rPr>
+          <w:b/>
+        </w:rPr>
+        <w:t>Game assets and pipeline automation.</w:t>
       </w:r>
     </w:p>
     <w:p>
@@ -245,7 +207,7 @@
         <w:jc w:val="left"/>
       </w:pPr>
       <w:r>
-        <w:t>Obstacle: agents kept producing near-duplicate ideas. The model was the obvious suspect and swapping it changed nothing; the cause was the shape of the data handed to them. The clearest case I have of an AI failure that is not an AI problem.</w:t>
+        <w:t>Chief GenAI Art Director · GPT Journey · Mar 2024 to Aug 2025</w:t>
       </w:r>
     </w:p>
     <w:p>
@@ -253,7 +215,7 @@
         <w:jc w:val="left"/>
       </w:pPr>
       <w:r>
-        <w:t>Multilingual content platform · Jun 2026 to present · running daily</w:t>
+        <w:t>AI generated commercials and custom model training for brand campaigns.</w:t>
       </w:r>
     </w:p>
     <w:p>
@@ -261,7 +223,7 @@
         <w:jc w:val="left"/>
       </w:pPr>
       <w:r>
-        <w:t>Assistant infrastructure with persistent memory and 13 scheduled jobs, chaining research, generation, media production and publishing. Generated text is checked automatically against a written style specification before it can ship. Runs on AWS inside a Tailscale private network.</w:t>
+        <w:t>Generative AI Creator · Fiverr · Oct 2022 to Jun 2025</w:t>
       </w:r>
     </w:p>
     <w:p>
@@ -269,7 +231,7 @@
         <w:jc w:val="left"/>
       </w:pPr>
       <w:r>
-        <w:t>Distributed render pipeline · Feb 2026 to present · in production</w:t>
+        <w:t>Graphic Designer and Photographer · Creww Digital · Jun 2020 to Nov 2022</w:t>
       </w:r>
     </w:p>
     <w:p>
@@ -277,7 +239,15 @@
         <w:jc w:val="left"/>
       </w:pPr>
       <w:r>
-        <w:t>Parametric video rendering where theme, camera movement and event data are parameters and jobs are processed from a queue. Orchestration on macOS, GPU-bound work on Windows, connected over a private network. Over 3,600 files, actively developed.</w:t>
+        <w:t>Official Photographer · Istanbul Governorship · Jan 2018 to Apr 2020</w:t>
+      </w:r>
+    </w:p>
+    <w:p>
+      <w:pPr>
+        <w:jc w:val="left"/>
+      </w:pPr>
+      <w:r>
+        <w:t>News Editor · Skala Media Solutions · Feb 2017 to Jan 2018</w:t>
       </w:r>
     </w:p>
     <w:p>
@@ -295,7 +265,7 @@
         <w:jc w:val="left"/>
       </w:pPr>
       <w:r>
-        <w:t>Languages: Python, TypeScript, JavaScript, SQL, Shell, Swift, C++</w:t>
+        <w:t>Languages: Python, TypeScript, JavaScript, Swift, C++, SQL, Shell</w:t>
       </w:r>
     </w:p>
     <w:p>
@@ -303,7 +273,7 @@
         <w:jc w:val="left"/>
       </w:pPr>
       <w:r>
-        <w:t>Agent and LLM: Claude Agent SDK, MCP servers, OpenRouter, Ollama, RAG pipelines, prompt and context distribution tooling</w:t>
+        <w:t>Backend and data: FastAPI, NestJS, PostgreSQL, SQLite, Supabase, Prisma, Redis, SQLAlchemy</w:t>
       </w:r>
     </w:p>
     <w:p>
@@ -311,7 +281,7 @@
         <w:jc w:val="left"/>
       </w:pPr>
       <w:r>
-        <w:t>Backend and data: FastAPI, SQLAlchemy, PostgreSQL, SQLite, Supabase, Prisma, REST API integration</w:t>
+        <w:t>Frontend: Next.js, React, Tailwind, Vite, SwiftUI, Tauri, Expo</w:t>
       </w:r>
     </w:p>
     <w:p>
@@ -319,7 +289,7 @@
         <w:jc w:val="left"/>
       </w:pPr>
       <w:r>
-        <w:t>Cloud and infrastructure: AWS, Cloudflare Workers, Docker, Tailscale, launchd and cron, GitHub Actions, headless CI</w:t>
+        <w:t>AI and agents: LLM APIs, agent orchestration, prompt evaluation, RAG, Deepgram, ElevenLabs, OpenRouter</w:t>
       </w:r>
     </w:p>
     <w:p>
@@ -327,7 +297,7 @@
         <w:jc w:val="left"/>
       </w:pPr>
       <w:r>
-        <w:t>Frontend: Next.js, React, Tailwind, SwiftUI</w:t>
+        <w:t>Infrastructure: Docker, AWS EC2, Cloudflare Workers, Tailscale, launchd and cron, CI/CD, Git</w:t>
       </w:r>
     </w:p>
     <w:p>
@@ -335,7 +305,7 @@
         <w:jc w:val="left"/>
       </w:pPr>
       <w:r>
-        <w:t>Testing and evaluation: pytest, vitest, Playwright, XCTest, custom evaluation harnesses, golden-output comparison</w:t>
+        <w:t>Integrations: REST APIs, Microsoft Graph, Outlook 365, Etsy, Printify, Telegram, WhatsApp</w:t>
       </w:r>
     </w:p>
     <w:p>
@@ -343,7 +313,7 @@
         <w:jc w:val="left"/>
       </w:pPr>
       <w:r>
-        <w:t>Integrations: Microsoft Graph and Outlook 365, Telegram, WhatsApp, marketplace and fulfilment APIs, Deepgram, ElevenLabs</w:t>
+        <w:t>Testing: pytest, vitest, XCTest, Playwright, unit and integration tests, automated checks in headless CI</w:t>
       </w:r>
     </w:p>
     <w:p>
@@ -353,7 +323,7 @@
           <w:color w:val="1A1A1A"/>
           <w:sz w:val="24"/>
         </w:rPr>
-        <w:t>EXPERIENCE</w:t>
+        <w:t>EDUCATION</w:t>
       </w:r>
     </w:p>
     <w:p>
@@ -361,55 +331,15 @@
         <w:jc w:val="left"/>
       </w:pPr>
       <w:r>
-        <w:t>AI Solutions Designer · Türkiye Maarif Vakfı · consulting engagement · Feb 2026 to present</w:t>
+        <w:t>Mechanical Engineering, Namik Kemal University, from 2012. I left before finishing and learned the rest by building. The engineering years are where the habit of taking a system apart before judging it comes from.</w:t>
       </w:r>
     </w:p>
     <w:p>
-      <w:pPr>
-        <w:jc w:val="left"/>
-      </w:pPr>
       <w:r>
-        <w:t>Generative AI Engineer · Pepper Root, Creative AI Studio · remote · Nov 2025 to Jan 2026</w:t>
-      </w:r>
-    </w:p>
-    <w:p>
-      <w:pPr>
-        <w:jc w:val="left"/>
-      </w:pPr>
-      <w:r>
-        <w:t>AI Artist · Joy Game · Istanbul · Aug 2025 to Oct 2025</w:t>
-      </w:r>
-    </w:p>
-    <w:p>
-      <w:pPr>
-        <w:jc w:val="left"/>
-      </w:pPr>
-      <w:r>
-        <w:t>Chief GenAI Art Director · GPT Journey · Istanbul · Mar 2024 to Aug 2025</w:t>
-      </w:r>
-    </w:p>
-    <w:p>
-      <w:pPr>
-        <w:jc w:val="left"/>
-      </w:pPr>
-      <w:r>
-        <w:t>Generative AI Creator · Fiverr · remote · Oct 2022 to Jun 2025</w:t>
-      </w:r>
-    </w:p>
-    <w:p>
-      <w:pPr>
-        <w:jc w:val="left"/>
-      </w:pPr>
-      <w:r>
-        <w:t>Education: Mechanical Engineering, Namık Kemal University, from 2012, left before finishing. Ten years in visual production before software.</w:t>
-      </w:r>
-    </w:p>
-    <w:p>
-      <w:pPr>
-        <w:jc w:val="left"/>
-      </w:pPr>
-      <w:r>
-        <w:t>Languages: Turkish (native), English (professional)</w:t>
+        <w:rPr>
+          <w:b/>
+        </w:rPr>
+        <w:t>Languages: Turkish native, English working proficiency.</w:t>
       </w:r>
     </w:p>
     <w:sectPr>

</xml_diff>